<commit_message>
add 2D FEA code
</commit_message>
<xml_diff>
--- a/AdvCFD/Programming HW2/Report.docx
+++ b/AdvCFD/Programming HW2/Report.docx
@@ -30,21 +30,7 @@
         <w:rPr>
           <w:rFonts w:ascii="Consolas" w:hAnsi="Consolas"/>
         </w:rPr>
-        <w:t>N=256; M=</w:t>
-      </w:r>
-      <w:proofErr w:type="gramStart"/>
-      <w:r>
-        <w:rPr>
-          <w:rFonts w:ascii="Consolas" w:hAnsi="Consolas"/>
-        </w:rPr>
-        <w:t>400; %</w:t>
-      </w:r>
-      <w:proofErr w:type="gramEnd"/>
-      <w:r>
-        <w:rPr>
-          <w:rFonts w:ascii="Consolas" w:hAnsi="Consolas"/>
-        </w:rPr>
-        <w:t>% Over-sample for error checking</w:t>
+        <w:t>N=256; M=400; %% Over-sample for error checking</w:t>
       </w:r>
     </w:p>
     <w:p>
@@ -59,28 +45,12 @@
         <w:rPr>
           <w:rFonts w:ascii="Consolas" w:hAnsi="Consolas"/>
         </w:rPr>
-        <w:t>L = pi; d=1; d2=d*</w:t>
-      </w:r>
-      <w:proofErr w:type="gramStart"/>
-      <w:r>
-        <w:rPr>
-          <w:rFonts w:ascii="Consolas" w:hAnsi="Consolas"/>
-        </w:rPr>
-        <w:t>d;</w:t>
-      </w:r>
-      <w:proofErr w:type="gramEnd"/>
-    </w:p>
-    <w:p>
-      <w:r>
-        <w:t xml:space="preserve">The above lines set the number of Fourier modes and Legendre points, as well as the domain length and operator coefficients on u and </w:t>
-      </w:r>
-      <w:proofErr w:type="gramStart"/>
-      <w:r>
-        <w:t>u’’</w:t>
-      </w:r>
-      <w:proofErr w:type="gramEnd"/>
-      <w:r>
-        <w:t xml:space="preserve">. </w:t>
+        <w:t>L = pi; d=1; d2=d*d;</w:t>
+      </w:r>
+    </w:p>
+    <w:p>
+      <w:r>
+        <w:t xml:space="preserve">The above lines set the number of Fourier modes and Legendre points, as well as the domain length and operator coefficients on u and u’’. </w:t>
       </w:r>
     </w:p>
     <w:p>
@@ -95,74 +65,8 @@
         <w:rPr>
           <w:rFonts w:ascii="Consolas" w:hAnsi="Consolas"/>
         </w:rPr>
-        <w:t>[</w:t>
-      </w:r>
-      <w:proofErr w:type="spellStart"/>
-      <w:proofErr w:type="gramStart"/>
-      <w:r>
-        <w:rPr>
-          <w:rFonts w:ascii="Consolas" w:hAnsi="Consolas"/>
-        </w:rPr>
-        <w:t>Ah,Bh</w:t>
-      </w:r>
-      <w:proofErr w:type="gramEnd"/>
-      <w:r>
-        <w:rPr>
-          <w:rFonts w:ascii="Consolas" w:hAnsi="Consolas"/>
-        </w:rPr>
-        <w:t>,</w:t>
-      </w:r>
-      <w:proofErr w:type="gramStart"/>
-      <w:r>
-        <w:rPr>
-          <w:rFonts w:ascii="Consolas" w:hAnsi="Consolas"/>
-        </w:rPr>
-        <w:t>Ch,Dh</w:t>
-      </w:r>
-      <w:proofErr w:type="gramEnd"/>
-      <w:r>
-        <w:rPr>
-          <w:rFonts w:ascii="Consolas" w:hAnsi="Consolas"/>
-        </w:rPr>
-        <w:t>,</w:t>
-      </w:r>
-      <w:proofErr w:type="gramStart"/>
-      <w:r>
-        <w:rPr>
-          <w:rFonts w:ascii="Consolas" w:hAnsi="Consolas"/>
-        </w:rPr>
-        <w:t>z,w</w:t>
-      </w:r>
-      <w:proofErr w:type="spellEnd"/>
-      <w:proofErr w:type="gramEnd"/>
-      <w:r>
-        <w:rPr>
-          <w:rFonts w:ascii="Consolas" w:hAnsi="Consolas"/>
-        </w:rPr>
-        <w:t>]=</w:t>
-      </w:r>
-      <w:proofErr w:type="spellStart"/>
-      <w:r>
-        <w:rPr>
-          <w:rFonts w:ascii="Consolas" w:hAnsi="Consolas"/>
-        </w:rPr>
-        <w:t>semhat</w:t>
-      </w:r>
-      <w:proofErr w:type="spellEnd"/>
-      <w:r>
-        <w:rPr>
-          <w:rFonts w:ascii="Consolas" w:hAnsi="Consolas"/>
-        </w:rPr>
-        <w:t>(M</w:t>
-      </w:r>
-      <w:proofErr w:type="gramStart"/>
-      <w:r>
-        <w:rPr>
-          <w:rFonts w:ascii="Consolas" w:hAnsi="Consolas"/>
-        </w:rPr>
-        <w:t>);</w:t>
-      </w:r>
-      <w:proofErr w:type="gramEnd"/>
+        <w:t>[Ah,Bh,Ch,Dh,z,w]=semhat(M);</w:t>
+      </w:r>
     </w:p>
     <w:p>
       <w:pPr>
@@ -176,93 +80,7 @@
         <w:rPr>
           <w:rFonts w:ascii="Consolas" w:hAnsi="Consolas"/>
         </w:rPr>
-        <w:t>Ab = (2/</w:t>
-      </w:r>
-      <w:proofErr w:type="gramStart"/>
-      <w:r>
-        <w:rPr>
-          <w:rFonts w:ascii="Consolas" w:hAnsi="Consolas"/>
-        </w:rPr>
-        <w:t>L)*</w:t>
-      </w:r>
-      <w:proofErr w:type="gramEnd"/>
-      <w:r>
-        <w:rPr>
-          <w:rFonts w:ascii="Consolas" w:hAnsi="Consolas"/>
-        </w:rPr>
-        <w:t>Ah; Bb = (L/</w:t>
-      </w:r>
-      <w:proofErr w:type="gramStart"/>
-      <w:r>
-        <w:rPr>
-          <w:rFonts w:ascii="Consolas" w:hAnsi="Consolas"/>
-        </w:rPr>
-        <w:t>2)*</w:t>
-      </w:r>
-      <w:proofErr w:type="spellStart"/>
-      <w:proofErr w:type="gramEnd"/>
-      <w:r>
-        <w:rPr>
-          <w:rFonts w:ascii="Consolas" w:hAnsi="Consolas"/>
-        </w:rPr>
-        <w:t>Bh</w:t>
-      </w:r>
-      <w:proofErr w:type="spellEnd"/>
-      <w:r>
-        <w:rPr>
-          <w:rFonts w:ascii="Consolas" w:hAnsi="Consolas"/>
-        </w:rPr>
-        <w:t xml:space="preserve">; </w:t>
-      </w:r>
-      <w:proofErr w:type="spellStart"/>
-      <w:r>
-        <w:rPr>
-          <w:rFonts w:ascii="Consolas" w:hAnsi="Consolas"/>
-        </w:rPr>
-        <w:t>Ib</w:t>
-      </w:r>
-      <w:proofErr w:type="spellEnd"/>
-      <w:r>
-        <w:rPr>
-          <w:rFonts w:ascii="Consolas" w:hAnsi="Consolas"/>
-        </w:rPr>
-        <w:t xml:space="preserve"> = eye(M+1); R = </w:t>
-      </w:r>
-      <w:proofErr w:type="spellStart"/>
-      <w:proofErr w:type="gramStart"/>
-      <w:r>
-        <w:rPr>
-          <w:rFonts w:ascii="Consolas" w:hAnsi="Consolas"/>
-        </w:rPr>
-        <w:t>Ib</w:t>
-      </w:r>
-      <w:proofErr w:type="spellEnd"/>
-      <w:r>
-        <w:rPr>
-          <w:rFonts w:ascii="Consolas" w:hAnsi="Consolas"/>
-        </w:rPr>
-        <w:t>(2:end</w:t>
-      </w:r>
-      <w:proofErr w:type="gramEnd"/>
-      <w:r>
-        <w:rPr>
-          <w:rFonts w:ascii="Consolas" w:hAnsi="Consolas"/>
-        </w:rPr>
-        <w:t>-</w:t>
-      </w:r>
-      <w:proofErr w:type="gramStart"/>
-      <w:r>
-        <w:rPr>
-          <w:rFonts w:ascii="Consolas" w:hAnsi="Consolas"/>
-        </w:rPr>
-        <w:t>1,:)</w:t>
-      </w:r>
-      <w:proofErr w:type="gramEnd"/>
-      <w:r>
-        <w:rPr>
-          <w:rFonts w:ascii="Consolas" w:hAnsi="Consolas"/>
-        </w:rPr>
-        <w:t>;</w:t>
+        <w:t>Ab = (2/L)*Ah; Bb = (L/2)*Bh; Ib = eye(M+1); R = Ib(2:end-1,:);</w:t>
       </w:r>
     </w:p>
     <w:p>
@@ -277,44 +95,12 @@
         <w:rPr>
           <w:rFonts w:ascii="Consolas" w:hAnsi="Consolas"/>
         </w:rPr>
-        <w:t xml:space="preserve">A=R*Ab*R’; B=R*Bb*R’; H = d2*A + </w:t>
-      </w:r>
-      <w:proofErr w:type="gramStart"/>
-      <w:r>
-        <w:rPr>
-          <w:rFonts w:ascii="Consolas" w:hAnsi="Consolas"/>
-        </w:rPr>
-        <w:t>B;</w:t>
-      </w:r>
-      <w:proofErr w:type="gramEnd"/>
-    </w:p>
-    <w:p>
-      <w:r>
-        <w:t xml:space="preserve">The above lines call </w:t>
-      </w:r>
-      <w:proofErr w:type="spellStart"/>
-      <w:r>
-        <w:t>semhat</w:t>
-      </w:r>
-      <w:proofErr w:type="spellEnd"/>
-      <w:r>
-        <w:t xml:space="preserve">, a function which computes the stiffness, mass and convection matrices for a 1D single Spectral Element. In addition, </w:t>
-      </w:r>
-      <w:proofErr w:type="spellStart"/>
-      <w:r>
-        <w:t>semhat</w:t>
-      </w:r>
-      <w:proofErr w:type="spellEnd"/>
-      <w:r>
-        <w:t xml:space="preserve"> returns the GLL points and weights through a call to </w:t>
-      </w:r>
-      <w:proofErr w:type="spellStart"/>
-      <w:r>
-        <w:t>zwgll</w:t>
-      </w:r>
-      <w:proofErr w:type="spellEnd"/>
-      <w:r>
-        <w:t>.  R is a restriction matrix to apply homogenous Dirichlet boundary conditions.</w:t>
+        <w:t>A=R*Ab*R’; B=R*Bb*R’; H = d2*A + B;</w:t>
+      </w:r>
+    </w:p>
+    <w:p>
+      <w:r>
+        <w:t>The above lines call semhat, a function which computes the stiffness, mass and convection matrices for a 1D single Spectral Element. In addition, semhat returns the GLL points and weights through a call to zwgll.  R is a restriction matrix to apply homogenous Dirichlet boundary conditions.</w:t>
       </w:r>
     </w:p>
     <w:p>
@@ -342,21 +128,7 @@
         <w:rPr>
           <w:rFonts w:ascii="Consolas" w:hAnsi="Consolas"/>
         </w:rPr>
-        <w:t>z=L*(1+z)/2; w=L*w/2; % Scale points and weights to [</w:t>
-      </w:r>
-      <w:proofErr w:type="gramStart"/>
-      <w:r>
-        <w:rPr>
-          <w:rFonts w:ascii="Consolas" w:hAnsi="Consolas"/>
-        </w:rPr>
-        <w:t>0,L</w:t>
-      </w:r>
-      <w:proofErr w:type="gramEnd"/>
-      <w:r>
-        <w:rPr>
-          <w:rFonts w:ascii="Consolas" w:hAnsi="Consolas"/>
-        </w:rPr>
-        <w:t>]</w:t>
+        <w:t>z=L*(1+z)/2; w=L*w/2; % Scale points and weights to [0,L]</w:t>
       </w:r>
     </w:p>
     <w:p>
@@ -367,42 +139,12 @@
           <w:rFonts w:ascii="Consolas" w:hAnsi="Consolas"/>
         </w:rPr>
       </w:pPr>
-      <w:proofErr w:type="spellStart"/>
-      <w:r>
-        <w:rPr>
-          <w:rFonts w:ascii="Consolas" w:hAnsi="Consolas"/>
-        </w:rPr>
-        <w:t>xb</w:t>
-      </w:r>
-      <w:proofErr w:type="spellEnd"/>
-      <w:r>
-        <w:rPr>
-          <w:rFonts w:ascii="Consolas" w:hAnsi="Consolas"/>
-        </w:rPr>
-        <w:t>=z; fb=1+0*</w:t>
-      </w:r>
-      <w:proofErr w:type="spellStart"/>
-      <w:r>
-        <w:rPr>
-          <w:rFonts w:ascii="Consolas" w:hAnsi="Consolas"/>
-        </w:rPr>
-        <w:t>xb</w:t>
-      </w:r>
-      <w:proofErr w:type="spellEnd"/>
-      <w:r>
-        <w:rPr>
-          <w:rFonts w:ascii="Consolas" w:hAnsi="Consolas"/>
-        </w:rPr>
-        <w:t xml:space="preserve">; % Set RHS for Legendre spectral </w:t>
-      </w:r>
-      <w:proofErr w:type="spellStart"/>
-      <w:r>
-        <w:rPr>
-          <w:rFonts w:ascii="Consolas" w:hAnsi="Consolas"/>
-        </w:rPr>
-        <w:t>soln</w:t>
-      </w:r>
-      <w:proofErr w:type="spellEnd"/>
+      <w:r>
+        <w:rPr>
+          <w:rFonts w:ascii="Consolas" w:hAnsi="Consolas"/>
+        </w:rPr>
+        <w:t>xb=z; fb=1+0*xb; % Set RHS for Legendre spectral soln</w:t>
+      </w:r>
     </w:p>
     <w:p>
       <w:pPr>
@@ -416,21 +158,7 @@
         <w:rPr>
           <w:rFonts w:ascii="Consolas" w:hAnsi="Consolas"/>
         </w:rPr>
-        <w:t>us= R’*(H\(R*Bb*</w:t>
-      </w:r>
-      <w:proofErr w:type="gramStart"/>
-      <w:r>
-        <w:rPr>
-          <w:rFonts w:ascii="Consolas" w:hAnsi="Consolas"/>
-        </w:rPr>
-        <w:t>fb))</w:t>
-      </w:r>
-      <w:proofErr w:type="gramEnd"/>
-      <w:r>
-        <w:rPr>
-          <w:rFonts w:ascii="Consolas" w:hAnsi="Consolas"/>
-        </w:rPr>
-        <w:t>; % Solve Legendre system</w:t>
+        <w:t>us= R’*(H\(R*Bb*fb)); % Solve Legendre system</w:t>
       </w:r>
     </w:p>
     <w:p>
@@ -453,30 +181,8 @@
         <w:rPr>
           <w:rFonts w:ascii="Consolas" w:hAnsi="Consolas"/>
         </w:rPr>
-        <w:t>plot(</w:t>
-      </w:r>
-      <w:proofErr w:type="gramStart"/>
-      <w:r>
-        <w:rPr>
-          <w:rFonts w:ascii="Consolas" w:hAnsi="Consolas"/>
-        </w:rPr>
-        <w:t>xb,us</w:t>
-      </w:r>
-      <w:proofErr w:type="gramEnd"/>
-      <w:r>
-        <w:rPr>
-          <w:rFonts w:ascii="Consolas" w:hAnsi="Consolas"/>
-        </w:rPr>
-        <w:t xml:space="preserve">,’k-’,’linewidth’,1.4); hold </w:t>
-      </w:r>
-      <w:proofErr w:type="gramStart"/>
-      <w:r>
-        <w:rPr>
-          <w:rFonts w:ascii="Consolas" w:hAnsi="Consolas"/>
-        </w:rPr>
-        <w:t>on;</w:t>
-      </w:r>
-      <w:proofErr w:type="gramEnd"/>
+        <w:t>plot(xb,us,’k-’,’linewidth’,1.4); hold on;</w:t>
+      </w:r>
     </w:p>
     <w:p>
       <w:r>
@@ -491,33 +197,11 @@
           <w:rFonts w:ascii="Consolas" w:hAnsi="Consolas"/>
         </w:rPr>
       </w:pPr>
-      <w:proofErr w:type="spellStart"/>
-      <w:r>
-        <w:rPr>
-          <w:rFonts w:ascii="Consolas" w:hAnsi="Consolas"/>
-        </w:rPr>
-        <w:t>uf</w:t>
-      </w:r>
-      <w:proofErr w:type="spellEnd"/>
-      <w:r>
-        <w:rPr>
-          <w:rFonts w:ascii="Consolas" w:hAnsi="Consolas"/>
-        </w:rPr>
-        <w:t>=0*</w:t>
-      </w:r>
-      <w:proofErr w:type="spellStart"/>
-      <w:r>
-        <w:rPr>
-          <w:rFonts w:ascii="Consolas" w:hAnsi="Consolas"/>
-        </w:rPr>
-        <w:t>xb</w:t>
-      </w:r>
-      <w:proofErr w:type="spellEnd"/>
-      <w:r>
-        <w:rPr>
-          <w:rFonts w:ascii="Consolas" w:hAnsi="Consolas"/>
-        </w:rPr>
-        <w:t>; %% Initialize Fourier solution on GLL pts</w:t>
+      <w:r>
+        <w:rPr>
+          <w:rFonts w:ascii="Consolas" w:hAnsi="Consolas"/>
+        </w:rPr>
+        <w:t>uf=0*xb; %% Initialize Fourier solution on GLL pts</w:t>
       </w:r>
     </w:p>
     <w:p>
@@ -532,30 +216,8 @@
         <w:rPr>
           <w:rFonts w:ascii="Consolas" w:hAnsi="Consolas"/>
         </w:rPr>
-        <w:t>for k=</w:t>
-      </w:r>
-      <w:proofErr w:type="gramStart"/>
-      <w:r>
-        <w:rPr>
-          <w:rFonts w:ascii="Consolas" w:hAnsi="Consolas"/>
-        </w:rPr>
-        <w:t>1:2:N</w:t>
-      </w:r>
-      <w:proofErr w:type="gramEnd"/>
-      <w:r>
-        <w:rPr>
-          <w:rFonts w:ascii="Consolas" w:hAnsi="Consolas"/>
-        </w:rPr>
-        <w:t>; k1=k+</w:t>
-      </w:r>
-      <w:proofErr w:type="gramStart"/>
-      <w:r>
-        <w:rPr>
-          <w:rFonts w:ascii="Consolas" w:hAnsi="Consolas"/>
-        </w:rPr>
-        <w:t>1;</w:t>
-      </w:r>
-      <w:proofErr w:type="gramEnd"/>
+        <w:t>for k=1:2:N; k1=k+1;</w:t>
+      </w:r>
     </w:p>
     <w:p>
       <w:pPr>
@@ -566,36 +228,12 @@
           <w:rFonts w:ascii="Consolas" w:hAnsi="Consolas"/>
         </w:rPr>
       </w:pPr>
-      <w:proofErr w:type="spellStart"/>
-      <w:r>
-        <w:rPr>
-          <w:rFonts w:ascii="Consolas" w:hAnsi="Consolas"/>
-        </w:rPr>
-        <w:t>sk</w:t>
-      </w:r>
-      <w:proofErr w:type="spellEnd"/>
-      <w:r>
-        <w:rPr>
-          <w:rFonts w:ascii="Consolas" w:hAnsi="Consolas"/>
-        </w:rPr>
-        <w:t xml:space="preserve"> = sin(k*</w:t>
-      </w:r>
-      <w:proofErr w:type="spellStart"/>
-      <w:r>
-        <w:rPr>
-          <w:rFonts w:ascii="Consolas" w:hAnsi="Consolas"/>
-        </w:rPr>
-        <w:t>xb</w:t>
-      </w:r>
-      <w:proofErr w:type="spellEnd"/>
-      <w:proofErr w:type="gramStart"/>
-      <w:r>
-        <w:rPr>
-          <w:rFonts w:ascii="Consolas" w:hAnsi="Consolas"/>
-        </w:rPr>
-        <w:t>);</w:t>
-      </w:r>
-      <w:proofErr w:type="gramEnd"/>
+      <w:r>
+        <w:rPr>
+          <w:rFonts w:ascii="Consolas" w:hAnsi="Consolas"/>
+        </w:rPr>
+        <w:t>sk = sin(k*xb);</w:t>
+      </w:r>
     </w:p>
     <w:p>
       <w:r>
@@ -615,51 +253,7 @@
         <w:rPr>
           <w:rFonts w:ascii="Consolas" w:hAnsi="Consolas"/>
         </w:rPr>
-        <w:t xml:space="preserve">% </w:t>
-      </w:r>
-      <w:proofErr w:type="spellStart"/>
-      <w:r>
-        <w:rPr>
-          <w:rFonts w:ascii="Consolas" w:hAnsi="Consolas"/>
-        </w:rPr>
-        <w:t>fk</w:t>
-      </w:r>
-      <w:proofErr w:type="spellEnd"/>
-      <w:r>
-        <w:rPr>
-          <w:rFonts w:ascii="Consolas" w:hAnsi="Consolas"/>
-        </w:rPr>
-        <w:t xml:space="preserve"> = 2*(w’*</w:t>
-      </w:r>
-      <w:proofErr w:type="spellStart"/>
-      <w:r>
-        <w:rPr>
-          <w:rFonts w:ascii="Consolas" w:hAnsi="Consolas"/>
-        </w:rPr>
-        <w:t>sk</w:t>
-      </w:r>
-      <w:proofErr w:type="spellEnd"/>
-      <w:r>
-        <w:rPr>
-          <w:rFonts w:ascii="Consolas" w:hAnsi="Consolas"/>
-        </w:rPr>
-        <w:t>)/(2*pi); % 2 in numerator because integrate over [-</w:t>
-      </w:r>
-      <w:proofErr w:type="spellStart"/>
-      <w:proofErr w:type="gramStart"/>
-      <w:r>
-        <w:rPr>
-          <w:rFonts w:ascii="Consolas" w:hAnsi="Consolas"/>
-        </w:rPr>
-        <w:t>pi,pi</w:t>
-      </w:r>
-      <w:proofErr w:type="spellEnd"/>
-      <w:proofErr w:type="gramEnd"/>
-      <w:r>
-        <w:rPr>
-          <w:rFonts w:ascii="Consolas" w:hAnsi="Consolas"/>
-        </w:rPr>
-        <w:t>]</w:t>
+        <w:t>% fk = 2*(w’*sk)/(2*pi); % 2 in numerator because integrate over [-pi,pi]</w:t>
       </w:r>
     </w:p>
     <w:p>
@@ -671,48 +265,16 @@
           <w:rFonts w:ascii="Consolas" w:hAnsi="Consolas"/>
         </w:rPr>
       </w:pPr>
-      <w:proofErr w:type="spellStart"/>
-      <w:r>
-        <w:rPr>
-          <w:rFonts w:ascii="Consolas" w:hAnsi="Consolas"/>
-        </w:rPr>
-        <w:t>fk</w:t>
-      </w:r>
-      <w:proofErr w:type="spellEnd"/>
-      <w:r>
-        <w:rPr>
-          <w:rFonts w:ascii="Consolas" w:hAnsi="Consolas"/>
-        </w:rPr>
-        <w:t xml:space="preserve"> = 2/(k*pi); % 2 in numerator because integrate over [-</w:t>
-      </w:r>
-      <w:proofErr w:type="spellStart"/>
-      <w:proofErr w:type="gramStart"/>
-      <w:r>
-        <w:rPr>
-          <w:rFonts w:ascii="Consolas" w:hAnsi="Consolas"/>
-        </w:rPr>
-        <w:t>pi,pi</w:t>
-      </w:r>
-      <w:proofErr w:type="spellEnd"/>
-      <w:proofErr w:type="gramEnd"/>
-      <w:r>
-        <w:rPr>
-          <w:rFonts w:ascii="Consolas" w:hAnsi="Consolas"/>
-        </w:rPr>
-        <w:t>]</w:t>
-      </w:r>
-    </w:p>
-    <w:p>
-      <w:r>
-        <w:t xml:space="preserve">The </w:t>
-      </w:r>
-      <w:proofErr w:type="spellStart"/>
-      <w:r>
-        <w:t>fourier</w:t>
-      </w:r>
-      <w:proofErr w:type="spellEnd"/>
-      <w:r>
-        <w:t xml:space="preserve"> coefficients for a square wave are pre-computed here. </w:t>
+      <w:r>
+        <w:rPr>
+          <w:rFonts w:ascii="Consolas" w:hAnsi="Consolas"/>
+        </w:rPr>
+        <w:t>fk = 2/(k*pi); % 2 in numerator because integrate over [-pi,pi]</w:t>
+      </w:r>
+    </w:p>
+    <w:p>
+      <w:r>
+        <w:t xml:space="preserve">The fourier coefficients for a square wave are pre-computed here. </w:t>
       </w:r>
     </w:p>
     <w:p>
@@ -724,41 +286,11 @@
           <w:rFonts w:ascii="Consolas" w:hAnsi="Consolas"/>
         </w:rPr>
       </w:pPr>
-      <w:proofErr w:type="spellStart"/>
-      <w:r>
-        <w:rPr>
-          <w:rFonts w:ascii="Consolas" w:hAnsi="Consolas"/>
-        </w:rPr>
-        <w:t>uk</w:t>
-      </w:r>
-      <w:proofErr w:type="spellEnd"/>
-      <w:r>
-        <w:rPr>
-          <w:rFonts w:ascii="Consolas" w:hAnsi="Consolas"/>
-        </w:rPr>
-        <w:t xml:space="preserve"> = 2*</w:t>
-      </w:r>
-      <w:proofErr w:type="spellStart"/>
-      <w:proofErr w:type="gramStart"/>
-      <w:r>
-        <w:rPr>
-          <w:rFonts w:ascii="Consolas" w:hAnsi="Consolas"/>
-        </w:rPr>
-        <w:t>fk</w:t>
-      </w:r>
-      <w:proofErr w:type="spellEnd"/>
-      <w:r>
-        <w:rPr>
-          <w:rFonts w:ascii="Consolas" w:hAnsi="Consolas"/>
-        </w:rPr>
-        <w:t>./</w:t>
-      </w:r>
-      <w:proofErr w:type="gramEnd"/>
-      <w:r>
-        <w:rPr>
-          <w:rFonts w:ascii="Consolas" w:hAnsi="Consolas"/>
-        </w:rPr>
-        <w:t>(1+d2*k*k); % 2 in numerator because +/- k mode.</w:t>
+      <w:r>
+        <w:rPr>
+          <w:rFonts w:ascii="Consolas" w:hAnsi="Consolas"/>
+        </w:rPr>
+        <w:t>uk = 2*fk./(1+d2*k*k); % 2 in numerator because +/- k mode.</w:t>
       </w:r>
     </w:p>
     <w:p>
@@ -770,77 +302,17 @@
           <w:rFonts w:ascii="Consolas" w:hAnsi="Consolas"/>
         </w:rPr>
       </w:pPr>
-      <w:proofErr w:type="spellStart"/>
-      <w:r>
-        <w:rPr>
-          <w:rFonts w:ascii="Consolas" w:hAnsi="Consolas"/>
-        </w:rPr>
-        <w:t>uf</w:t>
-      </w:r>
-      <w:proofErr w:type="spellEnd"/>
-      <w:r>
-        <w:rPr>
-          <w:rFonts w:ascii="Consolas" w:hAnsi="Consolas"/>
-        </w:rPr>
-        <w:t xml:space="preserve"> = </w:t>
-      </w:r>
-      <w:proofErr w:type="spellStart"/>
-      <w:r>
-        <w:rPr>
-          <w:rFonts w:ascii="Consolas" w:hAnsi="Consolas"/>
-        </w:rPr>
-        <w:t>uf</w:t>
-      </w:r>
-      <w:proofErr w:type="spellEnd"/>
-      <w:r>
-        <w:rPr>
-          <w:rFonts w:ascii="Consolas" w:hAnsi="Consolas"/>
-        </w:rPr>
-        <w:t xml:space="preserve"> + </w:t>
-      </w:r>
-      <w:proofErr w:type="spellStart"/>
-      <w:r>
-        <w:rPr>
-          <w:rFonts w:ascii="Consolas" w:hAnsi="Consolas"/>
-        </w:rPr>
-        <w:t>uk</w:t>
-      </w:r>
-      <w:proofErr w:type="spellEnd"/>
-      <w:r>
-        <w:rPr>
-          <w:rFonts w:ascii="Consolas" w:hAnsi="Consolas"/>
-        </w:rPr>
-        <w:t>*</w:t>
-      </w:r>
-      <w:proofErr w:type="spellStart"/>
-      <w:proofErr w:type="gramStart"/>
-      <w:r>
-        <w:rPr>
-          <w:rFonts w:ascii="Consolas" w:hAnsi="Consolas"/>
-        </w:rPr>
-        <w:t>sk</w:t>
-      </w:r>
-      <w:proofErr w:type="spellEnd"/>
-      <w:r>
-        <w:rPr>
-          <w:rFonts w:ascii="Consolas" w:hAnsi="Consolas"/>
-        </w:rPr>
-        <w:t>;</w:t>
-      </w:r>
-      <w:proofErr w:type="gramEnd"/>
+      <w:r>
+        <w:rPr>
+          <w:rFonts w:ascii="Consolas" w:hAnsi="Consolas"/>
+        </w:rPr>
+        <w:t>uf = uf + uk*sk;</w:t>
+      </w:r>
     </w:p>
     <w:p>
       <w:r>
         <w:lastRenderedPageBreak/>
-        <w:t xml:space="preserve">Add contribution from the kth component of the </w:t>
-      </w:r>
-      <w:proofErr w:type="spellStart"/>
-      <w:r>
-        <w:t>fourier</w:t>
-      </w:r>
-      <w:proofErr w:type="spellEnd"/>
-      <w:r>
-        <w:t xml:space="preserve"> series to the overall values. </w:t>
+        <w:t xml:space="preserve">Add contribution from the kth component of the fourier series to the overall values. </w:t>
       </w:r>
     </w:p>
     <w:p>
@@ -852,42 +324,12 @@
           <w:rFonts w:ascii="Consolas" w:hAnsi="Consolas"/>
         </w:rPr>
       </w:pPr>
-      <w:proofErr w:type="spellStart"/>
-      <w:r>
-        <w:rPr>
-          <w:rFonts w:ascii="Consolas" w:hAnsi="Consolas"/>
-        </w:rPr>
-        <w:t>ef</w:t>
-      </w:r>
-      <w:proofErr w:type="spellEnd"/>
-      <w:r>
-        <w:rPr>
-          <w:rFonts w:ascii="Consolas" w:hAnsi="Consolas"/>
-        </w:rPr>
-        <w:t>=</w:t>
-      </w:r>
-      <w:proofErr w:type="spellStart"/>
-      <w:r>
-        <w:rPr>
-          <w:rFonts w:ascii="Consolas" w:hAnsi="Consolas"/>
-        </w:rPr>
-        <w:t>uf</w:t>
-      </w:r>
-      <w:proofErr w:type="spellEnd"/>
-      <w:r>
-        <w:rPr>
-          <w:rFonts w:ascii="Consolas" w:hAnsi="Consolas"/>
-        </w:rPr>
-        <w:t>-</w:t>
-      </w:r>
-      <w:proofErr w:type="gramStart"/>
-      <w:r>
-        <w:rPr>
-          <w:rFonts w:ascii="Consolas" w:hAnsi="Consolas"/>
-        </w:rPr>
-        <w:t>us;</w:t>
-      </w:r>
-      <w:proofErr w:type="gramEnd"/>
+      <w:r>
+        <w:rPr>
+          <w:rFonts w:ascii="Consolas" w:hAnsi="Consolas"/>
+        </w:rPr>
+        <w:t>ef=uf-us;</w:t>
+      </w:r>
     </w:p>
     <w:p>
       <w:pPr>
@@ -898,73 +340,16 @@
           <w:rFonts w:ascii="Consolas" w:hAnsi="Consolas"/>
         </w:rPr>
       </w:pPr>
-      <w:proofErr w:type="spellStart"/>
-      <w:r>
-        <w:rPr>
-          <w:rFonts w:ascii="Consolas" w:hAnsi="Consolas"/>
-        </w:rPr>
-        <w:t>em</w:t>
-      </w:r>
-      <w:proofErr w:type="spellEnd"/>
-      <w:r>
-        <w:rPr>
-          <w:rFonts w:ascii="Consolas" w:hAnsi="Consolas"/>
-        </w:rPr>
-        <w:t>(k1/</w:t>
-      </w:r>
-      <w:proofErr w:type="gramStart"/>
-      <w:r>
-        <w:rPr>
-          <w:rFonts w:ascii="Consolas" w:hAnsi="Consolas"/>
-        </w:rPr>
-        <w:t>2)=</w:t>
-      </w:r>
-      <w:proofErr w:type="gramEnd"/>
-      <w:r>
-        <w:rPr>
-          <w:rFonts w:ascii="Consolas" w:hAnsi="Consolas"/>
-        </w:rPr>
-        <w:t>max(abs(</w:t>
-      </w:r>
-      <w:proofErr w:type="spellStart"/>
-      <w:r>
-        <w:rPr>
-          <w:rFonts w:ascii="Consolas" w:hAnsi="Consolas"/>
-        </w:rPr>
-        <w:t>ef</w:t>
-      </w:r>
-      <w:proofErr w:type="spellEnd"/>
-      <w:r>
-        <w:rPr>
-          <w:rFonts w:ascii="Consolas" w:hAnsi="Consolas"/>
-        </w:rPr>
-        <w:t>)</w:t>
-      </w:r>
-      <w:proofErr w:type="gramStart"/>
-      <w:r>
-        <w:rPr>
-          <w:rFonts w:ascii="Consolas" w:hAnsi="Consolas"/>
-        </w:rPr>
-        <w:t>);</w:t>
-      </w:r>
-      <w:proofErr w:type="gramEnd"/>
-    </w:p>
-    <w:p>
-      <w:proofErr w:type="gramStart"/>
-      <w:r>
-        <w:t>Compute</w:t>
-      </w:r>
-      <w:proofErr w:type="gramEnd"/>
-      <w:r>
-        <w:t xml:space="preserve"> error compared to Legendre solution (</w:t>
-      </w:r>
-      <w:proofErr w:type="spellStart"/>
-      <w:r>
-        <w:t>L_inf</w:t>
-      </w:r>
-      <w:proofErr w:type="spellEnd"/>
-      <w:r>
-        <w:t>)</w:t>
+      <w:r>
+        <w:rPr>
+          <w:rFonts w:ascii="Consolas" w:hAnsi="Consolas"/>
+        </w:rPr>
+        <w:t>em(k1/2)=max(abs(ef));</w:t>
+      </w:r>
+    </w:p>
+    <w:p>
+      <w:r>
+        <w:t>Compute error compared to Legendre solution (L_inf)</w:t>
       </w:r>
     </w:p>
     <w:p>
@@ -980,44 +365,8 @@
         <w:rPr>
           <w:rFonts w:ascii="Consolas" w:hAnsi="Consolas"/>
         </w:rPr>
-        <w:t>ef2(k1/2) = sqrt(</w:t>
-      </w:r>
-      <w:proofErr w:type="spellStart"/>
-      <w:r>
-        <w:rPr>
-          <w:rFonts w:ascii="Consolas" w:hAnsi="Consolas"/>
-        </w:rPr>
-        <w:t>ef</w:t>
-      </w:r>
-      <w:proofErr w:type="spellEnd"/>
-      <w:r>
-        <w:rPr>
-          <w:rFonts w:ascii="Consolas" w:hAnsi="Consolas"/>
-        </w:rPr>
-        <w:t>’*Bb*</w:t>
-      </w:r>
-      <w:proofErr w:type="spellStart"/>
-      <w:r>
-        <w:rPr>
-          <w:rFonts w:ascii="Consolas" w:hAnsi="Consolas"/>
-        </w:rPr>
-        <w:t>ef</w:t>
-      </w:r>
-      <w:proofErr w:type="spellEnd"/>
-      <w:r>
-        <w:rPr>
-          <w:rFonts w:ascii="Consolas" w:hAnsi="Consolas"/>
-        </w:rPr>
-        <w:t>/pi</w:t>
-      </w:r>
-      <w:proofErr w:type="gramStart"/>
-      <w:r>
-        <w:rPr>
-          <w:rFonts w:ascii="Consolas" w:hAnsi="Consolas"/>
-        </w:rPr>
-        <w:t>);</w:t>
-      </w:r>
-      <w:proofErr w:type="gramEnd"/>
+        <w:t>ef2(k1/2) = sqrt(ef’*Bb*ef/pi);</w:t>
+      </w:r>
     </w:p>
     <w:p>
       <w:r>
@@ -1033,28 +382,12 @@
           <w:rFonts w:ascii="Consolas" w:hAnsi="Consolas"/>
         </w:rPr>
       </w:pPr>
-      <w:proofErr w:type="spellStart"/>
-      <w:r>
-        <w:rPr>
-          <w:rFonts w:ascii="Consolas" w:hAnsi="Consolas"/>
-        </w:rPr>
-        <w:t>nN</w:t>
-      </w:r>
-      <w:proofErr w:type="spellEnd"/>
-      <w:r>
-        <w:rPr>
-          <w:rFonts w:ascii="Consolas" w:hAnsi="Consolas"/>
-        </w:rPr>
-        <w:t xml:space="preserve">(k1/2) = </w:t>
-      </w:r>
-      <w:proofErr w:type="gramStart"/>
-      <w:r>
-        <w:rPr>
-          <w:rFonts w:ascii="Consolas" w:hAnsi="Consolas"/>
-        </w:rPr>
-        <w:t>k;</w:t>
-      </w:r>
-      <w:proofErr w:type="gramEnd"/>
+      <w:r>
+        <w:rPr>
+          <w:rFonts w:ascii="Consolas" w:hAnsi="Consolas"/>
+        </w:rPr>
+        <w:t>nN(k1/2) = k;</w:t>
+      </w:r>
     </w:p>
     <w:p>
       <w:pPr>
@@ -1069,38 +402,8 @@
         <w:rPr>
           <w:rFonts w:ascii="Consolas" w:hAnsi="Consolas"/>
         </w:rPr>
-        <w:t>if k==1; plot(</w:t>
-      </w:r>
-      <w:proofErr w:type="gramStart"/>
-      <w:r>
-        <w:rPr>
-          <w:rFonts w:ascii="Consolas" w:hAnsi="Consolas"/>
-        </w:rPr>
-        <w:t>xb,</w:t>
-      </w:r>
-      <w:proofErr w:type="spellStart"/>
-      <w:r>
-        <w:rPr>
-          <w:rFonts w:ascii="Consolas" w:hAnsi="Consolas"/>
-        </w:rPr>
-        <w:t>uf</w:t>
-      </w:r>
-      <w:proofErr w:type="spellEnd"/>
-      <w:proofErr w:type="gramEnd"/>
-      <w:r>
-        <w:rPr>
-          <w:rFonts w:ascii="Consolas" w:hAnsi="Consolas"/>
-        </w:rPr>
-        <w:t xml:space="preserve">,’r--’); </w:t>
-      </w:r>
-      <w:proofErr w:type="gramStart"/>
-      <w:r>
-        <w:rPr>
-          <w:rFonts w:ascii="Consolas" w:hAnsi="Consolas"/>
-        </w:rPr>
-        <w:t>end;</w:t>
-      </w:r>
-      <w:proofErr w:type="gramEnd"/>
+        <w:t>if k==1; plot(xb,uf,’r--’); end;</w:t>
+      </w:r>
     </w:p>
     <w:p>
       <w:pPr>
@@ -1115,38 +418,8 @@
         <w:rPr>
           <w:rFonts w:ascii="Consolas" w:hAnsi="Consolas"/>
         </w:rPr>
-        <w:t>if k==3; plot(</w:t>
-      </w:r>
-      <w:proofErr w:type="gramStart"/>
-      <w:r>
-        <w:rPr>
-          <w:rFonts w:ascii="Consolas" w:hAnsi="Consolas"/>
-        </w:rPr>
-        <w:t>xb,</w:t>
-      </w:r>
-      <w:proofErr w:type="spellStart"/>
-      <w:r>
-        <w:rPr>
-          <w:rFonts w:ascii="Consolas" w:hAnsi="Consolas"/>
-        </w:rPr>
-        <w:t>uf</w:t>
-      </w:r>
-      <w:proofErr w:type="spellEnd"/>
-      <w:proofErr w:type="gramEnd"/>
-      <w:r>
-        <w:rPr>
-          <w:rFonts w:ascii="Consolas" w:hAnsi="Consolas"/>
-        </w:rPr>
-        <w:t xml:space="preserve">,’g--’); </w:t>
-      </w:r>
-      <w:proofErr w:type="gramStart"/>
-      <w:r>
-        <w:rPr>
-          <w:rFonts w:ascii="Consolas" w:hAnsi="Consolas"/>
-        </w:rPr>
-        <w:t>end;</w:t>
-      </w:r>
-      <w:proofErr w:type="gramEnd"/>
+        <w:t>if k==3; plot(xb,uf,’g--’); end;</w:t>
+      </w:r>
     </w:p>
     <w:p>
       <w:pPr>
@@ -1161,38 +434,8 @@
         <w:rPr>
           <w:rFonts w:ascii="Consolas" w:hAnsi="Consolas"/>
         </w:rPr>
-        <w:t>if k==5; plot(</w:t>
-      </w:r>
-      <w:proofErr w:type="gramStart"/>
-      <w:r>
-        <w:rPr>
-          <w:rFonts w:ascii="Consolas" w:hAnsi="Consolas"/>
-        </w:rPr>
-        <w:t>xb,</w:t>
-      </w:r>
-      <w:proofErr w:type="spellStart"/>
-      <w:r>
-        <w:rPr>
-          <w:rFonts w:ascii="Consolas" w:hAnsi="Consolas"/>
-        </w:rPr>
-        <w:t>uf</w:t>
-      </w:r>
-      <w:proofErr w:type="spellEnd"/>
-      <w:proofErr w:type="gramEnd"/>
-      <w:r>
-        <w:rPr>
-          <w:rFonts w:ascii="Consolas" w:hAnsi="Consolas"/>
-        </w:rPr>
-        <w:t xml:space="preserve">,’b--’); </w:t>
-      </w:r>
-      <w:proofErr w:type="gramStart"/>
-      <w:r>
-        <w:rPr>
-          <w:rFonts w:ascii="Consolas" w:hAnsi="Consolas"/>
-        </w:rPr>
-        <w:t>end;</w:t>
-      </w:r>
-      <w:proofErr w:type="gramEnd"/>
+        <w:t>if k==5; plot(xb,uf,’b--’); end;</w:t>
+      </w:r>
     </w:p>
     <w:p>
       <w:pPr>
@@ -1202,39 +445,21 @@
           <w:rFonts w:ascii="Consolas" w:hAnsi="Consolas"/>
         </w:rPr>
       </w:pPr>
-      <w:proofErr w:type="gramStart"/>
       <w:r>
         <w:rPr>
           <w:rFonts w:ascii="Consolas" w:hAnsi="Consolas"/>
         </w:rPr>
         <w:t>end;</w:t>
       </w:r>
-      <w:proofErr w:type="gramEnd"/>
-    </w:p>
-    <w:p>
-      <w:r>
-        <w:t xml:space="preserve">The above lines and the rest of the code </w:t>
-      </w:r>
-      <w:proofErr w:type="gramStart"/>
-      <w:r>
-        <w:t>is</w:t>
-      </w:r>
-      <w:proofErr w:type="gramEnd"/>
-      <w:r>
-        <w:t xml:space="preserve"> just for plotting purposes.</w:t>
-      </w:r>
-    </w:p>
-    <w:p>
-      <w:r>
-        <w:t xml:space="preserve">I ran this code </w:t>
-      </w:r>
-      <w:proofErr w:type="gramStart"/>
-      <w:r>
-        <w:t>and also</w:t>
-      </w:r>
-      <w:proofErr w:type="gramEnd"/>
-      <w:r>
-        <w:t xml:space="preserve"> added the exact solution to the plot, just to make sure that it lined up</w:t>
+    </w:p>
+    <w:p>
+      <w:r>
+        <w:t>The above lines and the rest of the code is just for plotting purposes.</w:t>
+      </w:r>
+    </w:p>
+    <w:p>
+      <w:r>
+        <w:t>I ran this code and also added the exact solution to the plot, just to make sure that it lined up</w:t>
       </w:r>
       <w:r>
         <w:t xml:space="preserve"> with the M=400 Legendre.</w:t>
@@ -1264,7 +489,7 @@
                     </pic:cNvPicPr>
                   </pic:nvPicPr>
                   <pic:blipFill>
-                    <a:blip r:embed="rId5">
+                    <a:blip r:embed="rId6">
                       <a:extLst>
                         <a:ext uri="{28A0092B-C50C-407E-A947-70E740481C1C}">
                           <a14:useLocalDpi xmlns:a14="http://schemas.microsoft.com/office/drawing/2010/main" val="0"/>
@@ -1317,7 +542,7 @@
                     </pic:cNvPicPr>
                   </pic:nvPicPr>
                   <pic:blipFill>
-                    <a:blip r:embed="rId6">
+                    <a:blip r:embed="rId7">
                       <a:extLst>
                         <a:ext uri="{28A0092B-C50C-407E-A947-70E740481C1C}">
                           <a14:useLocalDpi xmlns:a14="http://schemas.microsoft.com/office/drawing/2010/main" val="0"/>
@@ -1448,21 +673,7 @@
         <w:rPr>
           <w:rFonts w:eastAsiaTheme="minorEastAsia"/>
         </w:rPr>
-        <w:t xml:space="preserve">The odd Fourier coefficients </w:t>
-      </w:r>
-      <w:proofErr w:type="spellStart"/>
-      <w:r>
-        <w:rPr>
-          <w:rFonts w:eastAsiaTheme="minorEastAsia"/>
-        </w:rPr>
-        <w:t>f_k</w:t>
-      </w:r>
-      <w:proofErr w:type="spellEnd"/>
-      <w:r>
-        <w:rPr>
-          <w:rFonts w:eastAsiaTheme="minorEastAsia"/>
-        </w:rPr>
-        <w:t xml:space="preserve"> are then:</w:t>
+        <w:t>The odd Fourier coefficients f_k are then:</w:t>
       </w:r>
     </w:p>
     <w:p>
@@ -1610,7 +821,7 @@
                     </pic:cNvPicPr>
                   </pic:nvPicPr>
                   <pic:blipFill>
-                    <a:blip r:embed="rId7">
+                    <a:blip r:embed="rId8">
                       <a:extLst>
                         <a:ext uri="{28A0092B-C50C-407E-A947-70E740481C1C}">
                           <a14:useLocalDpi xmlns:a14="http://schemas.microsoft.com/office/drawing/2010/main" val="0"/>
@@ -1664,7 +875,7 @@
                     </pic:cNvPicPr>
                   </pic:nvPicPr>
                   <pic:blipFill>
-                    <a:blip r:embed="rId8">
+                    <a:blip r:embed="rId9">
                       <a:extLst>
                         <a:ext uri="{28A0092B-C50C-407E-A947-70E740481C1C}">
                           <a14:useLocalDpi xmlns:a14="http://schemas.microsoft.com/office/drawing/2010/main" val="0"/>
@@ -1698,15 +909,7 @@
     </w:p>
     <w:p>
       <w:r>
-        <w:t>These demonstrate better than power-law convergence (</w:t>
-      </w:r>
-      <w:proofErr w:type="spellStart"/>
-      <w:r>
-        <w:t>ie</w:t>
-      </w:r>
-      <w:proofErr w:type="spellEnd"/>
-      <w:r>
-        <w:t xml:space="preserve"> exponential convergence) which is expected for a smooth function. </w:t>
+        <w:t xml:space="preserve">These demonstrate better than power-law convergence (ie exponential convergence) which is expected for a smooth function. </w:t>
       </w:r>
     </w:p>
     <w:p>
@@ -1722,6 +925,360 @@
       <w:pPr>
         <w:pStyle w:val="Heading3"/>
       </w:pPr>
+      <w:r>
+        <w:t xml:space="preserve">Part a. </w:t>
+      </w:r>
+    </w:p>
+    <w:p>
+      <w:r>
+        <w:t>Flowchart documenting ck4_0.m code process submitted in separate .pdf file.</w:t>
+      </w:r>
+    </w:p>
+    <w:p>
+      <w:pPr>
+        <w:pStyle w:val="Heading3"/>
+      </w:pPr>
+      <w:r>
+        <w:t>Part b.</w:t>
+      </w:r>
+    </w:p>
+    <w:p>
+      <w:pPr>
+        <w:jc w:val="center"/>
+      </w:pPr>
+      <w:r>
+        <w:drawing>
+          <wp:inline distT="0" distB="0" distL="0" distR="0" wp14:anchorId="6C0F1DDC" wp14:editId="33608FE1">
+            <wp:extent cx="3552825" cy="3244610"/>
+            <wp:effectExtent l="0" t="0" r="0" b="0"/>
+            <wp:docPr id="862651891" name="Picture 1" descr="A graph of a function&#10;&#10;AI-generated content may be incorrect."/>
+            <wp:cNvGraphicFramePr>
+              <a:graphicFrameLocks xmlns:a="http://schemas.openxmlformats.org/drawingml/2006/main" noChangeAspect="1"/>
+            </wp:cNvGraphicFramePr>
+            <a:graphic xmlns:a="http://schemas.openxmlformats.org/drawingml/2006/main">
+              <a:graphicData uri="http://schemas.openxmlformats.org/drawingml/2006/picture">
+                <pic:pic xmlns:pic="http://schemas.openxmlformats.org/drawingml/2006/picture">
+                  <pic:nvPicPr>
+                    <pic:cNvPr id="862651891" name="Picture 1" descr="A graph of a function&#10;&#10;AI-generated content may be incorrect."/>
+                    <pic:cNvPicPr/>
+                  </pic:nvPicPr>
+                  <pic:blipFill>
+                    <a:blip r:embed="rId10"/>
+                    <a:stretch>
+                      <a:fillRect/>
+                    </a:stretch>
+                  </pic:blipFill>
+                  <pic:spPr>
+                    <a:xfrm>
+                      <a:off x="0" y="0"/>
+                      <a:ext cx="3563139" cy="3254029"/>
+                    </a:xfrm>
+                    <a:prstGeom prst="rect">
+                      <a:avLst/>
+                    </a:prstGeom>
+                  </pic:spPr>
+                </pic:pic>
+              </a:graphicData>
+            </a:graphic>
+          </wp:inline>
+        </w:drawing>
+      </w:r>
+    </w:p>
+    <w:p>
+      <w:pPr>
+        <w:jc w:val="center"/>
+      </w:pPr>
+      <w:r>
+        <w:drawing>
+          <wp:inline distT="0" distB="0" distL="0" distR="0" wp14:anchorId="49DDFB8F" wp14:editId="5C211D70">
+            <wp:extent cx="3314700" cy="3228645"/>
+            <wp:effectExtent l="0" t="0" r="0" b="0"/>
+            <wp:docPr id="368477135" name="Picture 1" descr="A graph of a function&#10;&#10;AI-generated content may be incorrect."/>
+            <wp:cNvGraphicFramePr>
+              <a:graphicFrameLocks xmlns:a="http://schemas.openxmlformats.org/drawingml/2006/main" noChangeAspect="1"/>
+            </wp:cNvGraphicFramePr>
+            <a:graphic xmlns:a="http://schemas.openxmlformats.org/drawingml/2006/main">
+              <a:graphicData uri="http://schemas.openxmlformats.org/drawingml/2006/picture">
+                <pic:pic xmlns:pic="http://schemas.openxmlformats.org/drawingml/2006/picture">
+                  <pic:nvPicPr>
+                    <pic:cNvPr id="368477135" name="Picture 1" descr="A graph of a function&#10;&#10;AI-generated content may be incorrect."/>
+                    <pic:cNvPicPr/>
+                  </pic:nvPicPr>
+                  <pic:blipFill>
+                    <a:blip r:embed="rId11"/>
+                    <a:stretch>
+                      <a:fillRect/>
+                    </a:stretch>
+                  </pic:blipFill>
+                  <pic:spPr>
+                    <a:xfrm>
+                      <a:off x="0" y="0"/>
+                      <a:ext cx="3321709" cy="3235472"/>
+                    </a:xfrm>
+                    <a:prstGeom prst="rect">
+                      <a:avLst/>
+                    </a:prstGeom>
+                  </pic:spPr>
+                </pic:pic>
+              </a:graphicData>
+            </a:graphic>
+          </wp:inline>
+        </w:drawing>
+      </w:r>
+    </w:p>
+    <w:p>
+      <w:pPr>
+        <w:ind w:firstLine="720"/>
+        <w:rPr>
+          <w:rFonts w:eastAsiaTheme="minorEastAsia"/>
+        </w:rPr>
+      </w:pPr>
+      <w:r>
+        <w:lastRenderedPageBreak/>
+        <w:t xml:space="preserve">The first plot clearly shows exponential convergence, and the second shows power-law convergence of order 4. Of note in the first plot is the error threshold which is reached after N=100. This is the threshold at which the temporal error dominates for the given timestep of </w:t>
+      </w:r>
+      <m:oMath>
+        <m:r>
+          <w:rPr>
+            <w:rFonts w:ascii="Cambria Math" w:hAnsi="Cambria Math"/>
+          </w:rPr>
+          <m:t>π/4000</m:t>
+        </m:r>
+      </m:oMath>
+      <w:r>
+        <w:rPr>
+          <w:rFonts w:eastAsiaTheme="minorEastAsia"/>
+        </w:rPr>
+        <w:t xml:space="preserve">. </w:t>
+      </w:r>
+      <w:r>
+        <w:rPr>
+          <w:rFonts w:eastAsiaTheme="minorEastAsia"/>
+        </w:rPr>
+        <w:br/>
+      </w:r>
+    </w:p>
+    <w:p>
+      <w:pPr>
+        <w:ind w:firstLine="720"/>
+        <w:rPr>
+          <w:rFonts w:eastAsiaTheme="minorEastAsia"/>
+        </w:rPr>
+      </w:pPr>
+      <w:r>
+        <w:rPr>
+          <w:rFonts w:eastAsiaTheme="minorEastAsia"/>
+        </w:rPr>
+        <w:t>To capture the 4</w:t>
+      </w:r>
+      <w:r>
+        <w:rPr>
+          <w:rFonts w:eastAsiaTheme="minorEastAsia"/>
+          <w:vertAlign w:val="superscript"/>
+        </w:rPr>
+        <w:t>th</w:t>
+      </w:r>
+      <w:r>
+        <w:rPr>
+          <w:rFonts w:eastAsiaTheme="minorEastAsia"/>
+        </w:rPr>
+        <w:t xml:space="preserve">-order temporal convergence behavior, the convergence comparison must be made at sufficient </w:t>
+      </w:r>
+      <m:oMath>
+        <m:r>
+          <w:rPr>
+            <w:rFonts w:ascii="Cambria Math" w:eastAsiaTheme="minorEastAsia" w:hAnsi="Cambria Math"/>
+          </w:rPr>
+          <m:t>N</m:t>
+        </m:r>
+      </m:oMath>
+      <w:r>
+        <w:rPr>
+          <w:rFonts w:eastAsiaTheme="minorEastAsia"/>
+        </w:rPr>
+        <w:t xml:space="preserve"> such that the temporal error dominates. If </w:t>
+      </w:r>
+      <m:oMath>
+        <m:r>
+          <m:rPr>
+            <m:sty m:val="p"/>
+          </m:rPr>
+          <w:rPr>
+            <w:rFonts w:ascii="Cambria Math" w:eastAsiaTheme="minorEastAsia" w:hAnsi="Cambria Math"/>
+          </w:rPr>
+          <m:t>Δ</m:t>
+        </m:r>
+        <m:r>
+          <w:rPr>
+            <w:rFonts w:ascii="Cambria Math" w:eastAsiaTheme="minorEastAsia" w:hAnsi="Cambria Math"/>
+          </w:rPr>
+          <m:t>t</m:t>
+        </m:r>
+      </m:oMath>
+      <w:r>
+        <w:rPr>
+          <w:rFonts w:eastAsiaTheme="minorEastAsia"/>
+        </w:rPr>
+        <w:t xml:space="preserve"> was allowed to further decrease, a threshold would be reached where the spatial error dominated and the 4</w:t>
+      </w:r>
+      <w:r>
+        <w:rPr>
+          <w:rFonts w:eastAsiaTheme="minorEastAsia"/>
+          <w:vertAlign w:val="superscript"/>
+        </w:rPr>
+        <w:t>th</w:t>
+      </w:r>
+      <w:r>
+        <w:rPr>
+          <w:rFonts w:eastAsiaTheme="minorEastAsia"/>
+        </w:rPr>
+        <w:t xml:space="preserve"> order temporal convergence would stop.  </w:t>
+      </w:r>
+    </w:p>
+    <w:p>
+      <w:pPr>
+        <w:jc w:val="center"/>
+      </w:pPr>
+      <w:r>
+        <w:drawing>
+          <wp:inline distT="0" distB="0" distL="0" distR="0" wp14:anchorId="3BF01163" wp14:editId="13318F93">
+            <wp:extent cx="3648075" cy="2379434"/>
+            <wp:effectExtent l="0" t="0" r="0" b="1905"/>
+            <wp:docPr id="876375990" name="Picture 1" descr="A graph of a graph&#10;&#10;AI-generated content may be incorrect."/>
+            <wp:cNvGraphicFramePr>
+              <a:graphicFrameLocks xmlns:a="http://schemas.openxmlformats.org/drawingml/2006/main" noChangeAspect="1"/>
+            </wp:cNvGraphicFramePr>
+            <a:graphic xmlns:a="http://schemas.openxmlformats.org/drawingml/2006/main">
+              <a:graphicData uri="http://schemas.openxmlformats.org/drawingml/2006/picture">
+                <pic:pic xmlns:pic="http://schemas.openxmlformats.org/drawingml/2006/picture">
+                  <pic:nvPicPr>
+                    <pic:cNvPr id="876375990" name="Picture 1" descr="A graph of a graph&#10;&#10;AI-generated content may be incorrect."/>
+                    <pic:cNvPicPr/>
+                  </pic:nvPicPr>
+                  <pic:blipFill>
+                    <a:blip r:embed="rId12"/>
+                    <a:stretch>
+                      <a:fillRect/>
+                    </a:stretch>
+                  </pic:blipFill>
+                  <pic:spPr>
+                    <a:xfrm>
+                      <a:off x="0" y="0"/>
+                      <a:ext cx="3651437" cy="2381627"/>
+                    </a:xfrm>
+                    <a:prstGeom prst="rect">
+                      <a:avLst/>
+                    </a:prstGeom>
+                  </pic:spPr>
+                </pic:pic>
+              </a:graphicData>
+            </a:graphic>
+          </wp:inline>
+        </w:drawing>
+      </w:r>
+    </w:p>
+    <w:p>
+      <w:pPr>
+        <w:jc w:val="center"/>
+        <w:rPr>
+          <w:b/>
+          <w:bCs/>
+        </w:rPr>
+      </w:pPr>
+      <w:r>
+        <w:rPr>
+          <w:b/>
+          <w:bCs/>
+        </w:rPr>
+        <w:t>Figure: Error when spatial error dominates</w:t>
+      </w:r>
+    </w:p>
+    <w:p>
+      <w:pPr>
+        <w:jc w:val="center"/>
+        <w:rPr>
+          <w:b/>
+          <w:bCs/>
+        </w:rPr>
+      </w:pPr>
+      <w:r>
+        <w:rPr>
+          <w:b/>
+          <w:bCs/>
+        </w:rPr>
+        <w:drawing>
+          <wp:inline distT="0" distB="0" distL="0" distR="0" wp14:anchorId="255673C9" wp14:editId="32DB2A4A">
+            <wp:extent cx="3609975" cy="2449461"/>
+            <wp:effectExtent l="0" t="0" r="0" b="8255"/>
+            <wp:docPr id="714056779" name="Picture 1" descr="A graph of a graph of a function&#10;&#10;AI-generated content may be incorrect."/>
+            <wp:cNvGraphicFramePr>
+              <a:graphicFrameLocks xmlns:a="http://schemas.openxmlformats.org/drawingml/2006/main" noChangeAspect="1"/>
+            </wp:cNvGraphicFramePr>
+            <a:graphic xmlns:a="http://schemas.openxmlformats.org/drawingml/2006/main">
+              <a:graphicData uri="http://schemas.openxmlformats.org/drawingml/2006/picture">
+                <pic:pic xmlns:pic="http://schemas.openxmlformats.org/drawingml/2006/picture">
+                  <pic:nvPicPr>
+                    <pic:cNvPr id="714056779" name="Picture 1" descr="A graph of a graph of a function&#10;&#10;AI-generated content may be incorrect."/>
+                    <pic:cNvPicPr/>
+                  </pic:nvPicPr>
+                  <pic:blipFill>
+                    <a:blip r:embed="rId13"/>
+                    <a:stretch>
+                      <a:fillRect/>
+                    </a:stretch>
+                  </pic:blipFill>
+                  <pic:spPr>
+                    <a:xfrm>
+                      <a:off x="0" y="0"/>
+                      <a:ext cx="3614093" cy="2452255"/>
+                    </a:xfrm>
+                    <a:prstGeom prst="rect">
+                      <a:avLst/>
+                    </a:prstGeom>
+                  </pic:spPr>
+                </pic:pic>
+              </a:graphicData>
+            </a:graphic>
+          </wp:inline>
+        </w:drawing>
+      </w:r>
+    </w:p>
+    <w:p>
+      <w:pPr>
+        <w:jc w:val="center"/>
+        <w:rPr>
+          <w:b/>
+          <w:bCs/>
+        </w:rPr>
+      </w:pPr>
+      <w:r>
+        <w:rPr>
+          <w:b/>
+          <w:bCs/>
+        </w:rPr>
+        <w:t>Figure: Error when temporal error dominates</w:t>
+      </w:r>
+    </w:p>
+    <w:p>
+      <w:r>
+        <w:t xml:space="preserve">When temporal error dominates, the error appears in a coherent structure associated with the wave form moving around the domain. When spatial error dominates, the error appears in noise distributed mostly randomly around the domain. </w:t>
+      </w:r>
+    </w:p>
+    <w:p>
+      <w:r>
+        <w:lastRenderedPageBreak/>
+        <w:t>Other errors might be associated with domain boundary conditions. If there is any interaction between the waveform and the boundary, some energy may be spuriously reflected back into the domain. I think some of this error is present at roughly x=1, y=0.5 in the spatial error plot.</w:t>
+      </w:r>
+    </w:p>
+    <w:p>
+      <w:r>
+        <w:t>The temporal error looks like it is associated with diffusion error on the waveform. It does not appear there is any dispersion error.</w:t>
+      </w:r>
+    </w:p>
+    <w:p>
+      <w:r>
+        <w:t>There is no iterative solver error, because the problem is small enough that the matrix is solved directly. However, there may be error from the direct matrix solution.</w:t>
+      </w:r>
     </w:p>
     <w:sectPr>
       <w:pgSz w:w="12240" w:h="15840"/>
@@ -2427,6 +1984,7 @@
   <w:style w:type="character" w:default="1" w:styleId="DefaultParagraphFont">
     <w:name w:val="Default Paragraph Font"/>
     <w:uiPriority w:val="1"/>
+    <w:semiHidden/>
     <w:unhideWhenUsed/>
   </w:style>
   <w:style w:type="table" w:default="1" w:styleId="TableNormal">
@@ -3043,4 +2601,16 @@
     </a:ext>
   </a:extLst>
 </a:theme>
+</file>
+
+<file path=customXml/item1.xml><?xml version="1.0" encoding="utf-8"?>
+<b:Sources xmlns:b="http://schemas.openxmlformats.org/officeDocument/2006/bibliography" xmlns="http://schemas.openxmlformats.org/officeDocument/2006/bibliography" SelectedStyle="\APASixthEditionOfficeOnline.xsl" StyleName="APA" Version="6"/>
+</file>
+
+<file path=customXml/itemProps1.xml><?xml version="1.0" encoding="utf-8"?>
+<ds:datastoreItem xmlns:ds="http://schemas.openxmlformats.org/officeDocument/2006/customXml" ds:itemID="{FBE415E8-4F00-44A1-9E09-9D3E9CF26F36}">
+  <ds:schemaRefs>
+    <ds:schemaRef ds:uri="http://schemas.openxmlformats.org/officeDocument/2006/bibliography"/>
+  </ds:schemaRefs>
+</ds:datastoreItem>
 </file>
</xml_diff>